<commit_message>
GigaScience cover letter filled into the formatted docx; source bundle frozen
Co-Authored-By: Claude Fable 5.1 <noreply@anthropic.com>
</commit_message>
<xml_diff>
--- a/submission_giga/CoverLetter.docx
+++ b/submission_giga/CoverLetter.docx
@@ -29,124 +29,98 @@
         <w:rPr>
           <w:rFonts w:ascii="Times New Roman" w:hAnsi="Times New Roman" w:cs="Times New Roman"/>
         </w:rPr>
-        <w:t>We submit a Problem Solving Protocol: a reusable procedure for auditing cross-cohort feature-selection benchmarks on public transcriptome cohorts, applied in two further tissues against predictions that were written and hash-stamped before those data were read. It is not a biomarker discovery study and reports no new biomarker. The title is "Auditing cross-cohort feature-selection benchmarks: cohort composition and tissue-context-dependent confounding across kidney, liver and colon transcriptomes."</w:t>
-      </w:r>
-    </w:p>
-    <w:p>
-      <w:pPr>
-        <w:rPr>
-          <w:rFonts w:ascii="Times New Roman" w:hAnsi="Times New Roman" w:cs="Times New Roman"/>
-        </w:rPr>
-      </w:pPr>
-      <w:r>
-        <w:rPr>
-          <w:rFonts w:ascii="Times New Roman" w:hAnsi="Times New Roman" w:cs="Times New Roman"/>
-        </w:rPr>
-        <w:t>Methods for deriving reproducible signatures are usually compared on one fixed collection of public cohorts. The protocol asks whether such a comparison measures the methods or the cohorts, through four checks: a patient-overlap and procurement audit, a cohort-composition sensitivity analysis, a control-definition sensitivity analysis, and a correction benchmark. It condenses them into a nine-item reporting checklist (Table 4). The analyses in the manuscript are the application that shows what each check detects.</w:t>
-      </w:r>
-    </w:p>
-    <w:p>
-      <w:pPr>
-        <w:rPr>
-          <w:rFonts w:ascii="Times New Roman" w:hAnsi="Times New Roman" w:cs="Times New Roman"/>
-        </w:rPr>
-      </w:pPr>
-      <w:r>
-        <w:rPr>
-          <w:rFonts w:ascii="Times New Roman" w:hAnsi="Times New Roman" w:cs="Times New Roman"/>
-        </w:rPr>
-        <w:t>We think three results make it useful to your readership beyond the disease in which it was developed:</w:t>
-      </w:r>
-    </w:p>
-    <w:p>
-      <w:pPr>
-        <w:rPr>
-          <w:rFonts w:ascii="Times New Roman" w:hAnsi="Times New Roman" w:cs="Times New Roman"/>
-        </w:rPr>
-      </w:pPr>
-      <w:r>
-        <w:rPr>
-          <w:rFonts w:ascii="Times New Roman" w:hAnsi="Times New Roman" w:cs="Times New Roman"/>
-        </w:rPr>
-        <w:t>1. A benchmark verdict can be a property of the cohorts. On five diabetic kidney disease discovery cohorts, the reproducibility difference between a stability selector and a co-expression hub criterion ranged from -0.106 to +0.170 across three-cohort subsets, while the mean external AUROC advantage stayed positive.</w:t>
-      </w:r>
-    </w:p>
-    <w:p>
-      <w:pPr>
-        <w:rPr>
-          <w:rFonts w:ascii="Times New Roman" w:hAnsi="Times New Roman" w:cs="Times New Roman"/>
-        </w:rPr>
-      </w:pPr>
-      <w:r>
-        <w:rPr>
-          <w:rFonts w:ascii="Times New Roman" w:hAnsi="Times New Roman" w:cs="Times New Roman"/>
-        </w:rPr>
-        <w:t>2. A shared pre-analytical confounder becomes the most reproducible signal. Every discovery contrast compares needle biopsies with surgical tissue, and an immediate-early module tracked that contrast in 8 of 9 kidney datasets. Substituting a biopsy control retained only 14-56% of the naive signal across seven diagnoses; batch correction by cohort could not touch it.</w:t>
-      </w:r>
-    </w:p>
-    <w:p>
-      <w:pPr>
-        <w:rPr>
-          <w:rFonts w:ascii="Times New Roman" w:hAnsi="Times New Roman" w:cs="Times New Roman"/>
-        </w:rPr>
-      </w:pPr>
-      <w:r>
-        <w:rPr>
-          <w:rFonts w:ascii="Times New Roman" w:hAnsi="Times New Roman" w:cs="Times New Roman"/>
-        </w:rPr>
-        <w:t>3. Both findings were tested outside kidney against predictions fixed in advance. Before any liver or colon expression value was read, we hashed three predictions. Verdict instability recurred in liver but not in colon, whose cohorts agree closely about effects, and the confounder was most prominent among the most reproducible genes in kidney. Two predictions failed: in colon, where both arms are biopsies, the module rose with inflammation, so the confounding it indexes depends on tissue context. We report the failures in full, and accordingly present a control obtained by the same procedure as the design alternative to prefer where clinically defensible and available, not as a universal fix.</w:t>
-      </w:r>
-    </w:p>
-    <w:p>
-      <w:pPr>
-        <w:rPr>
-          <w:rFonts w:ascii="Times New Roman" w:hAnsi="Times New Roman" w:cs="Times New Roman"/>
-        </w:rPr>
-      </w:pPr>
-      <w:r>
-        <w:rPr>
-          <w:rFonts w:ascii="Times New Roman" w:hAnsi="Times New Roman" w:cs="Times New Roman"/>
-        </w:rPr>
-        <w:t>The audited pipeline declining to promote its own uncorrected candidates is the intended outcome of the application, not a shortfall. All data are public; the harmonised cohorts, audit database and code regenerating every figure and table are released at https://github.com/kdh6126/dkd-cross-cohort-audit (https://doi.org/10.5281/zenodo.23051697).</w:t>
-      </w:r>
-    </w:p>
-    <w:p>
-      <w:pPr>
-        <w:rPr>
-          <w:rFonts w:ascii="Times New Roman" w:hAnsi="Times New Roman" w:cs="Times New Roman"/>
-        </w:rPr>
-      </w:pPr>
-      <w:r>
-        <w:rPr>
-          <w:rFonts w:ascii="Times New Roman" w:hAnsi="Times New Roman" w:cs="Times New Roman"/>
-        </w:rPr>
-        <w:t>Use of AI tools. Claude Code (Anthropic) and ChatGPT (OpenAI) assisted with code development and refactoring, proposals for control analyses, language editing and revision of author-written text, and the code that draws the figures; no figure or result was generated by an AI model directly. Numerical results were computed from the cited datasets or explicitly described simulations using the analysis code. Automated checks were used to assess numerical consistency and provenance. The authors reviewed the code, analyses and manuscript and take responsibility for the final content.</w:t>
-      </w:r>
-    </w:p>
-    <w:p>
-      <w:pPr>
-        <w:rPr>
-          <w:rFonts w:ascii="Times New Roman" w:hAnsi="Times New Roman" w:cs="Times New Roman"/>
-        </w:rPr>
-      </w:pPr>
-      <w:r>
-        <w:rPr>
-          <w:rFonts w:ascii="Times New Roman" w:hAnsi="Times New Roman" w:cs="Times New Roman"/>
-        </w:rPr>
-        <w:t>The same statement appears in the manuscript.</w:t>
-      </w:r>
-    </w:p>
-    <w:p>
-      <w:pPr>
-        <w:rPr>
-          <w:rFonts w:ascii="Times New Roman" w:hAnsi="Times New Roman" w:cs="Times New Roman"/>
-        </w:rPr>
-      </w:pPr>
-      <w:r>
-        <w:rPr>
-          <w:rFonts w:ascii="Times New Roman" w:hAnsi="Times New Roman" w:cs="Times New Roman"/>
-        </w:rPr>
-        <w:t>The manuscript is original, is not under consideration elsewhere, and all authors have approved the submission. The authors declare no competing interests.</w:t>
+        <w:t>We submit a Research article, transferred through the OUP Transfer Desk after an editorial decision at Briefings in Bioinformatics (manuscript BIB-26-2439, declined before peer review without reviewer reports), entitled "Auditing cross-cohort feature-selection benchmarks: cohort composition and tissue-context-dependent confounding across kidney, liver and colon transcriptomes." This is the full-length version of that submission: every method and control analysis is in the main text, and the complete data tables and audit records are supplied as Additional files 1-7.</w:t>
+      </w:r>
+    </w:p>
+    <w:p>
+      <w:pPr>
+        <w:rPr>
+          <w:rFonts w:ascii="Times New Roman" w:hAnsi="Times New Roman" w:cs="Times New Roman"/>
+        </w:rPr>
+      </w:pPr>
+      <w:r>
+        <w:rPr>
+          <w:rFonts w:ascii="Times New Roman" w:hAnsi="Times New Roman" w:cs="Times New Roman"/>
+        </w:rPr>
+        <w:t>Why GigaScience. The article is built around reproducibility as a measured property rather than a claim, which is the criterion your journal states. It asks whether a cross-cohort feature-selection benchmark measures the methods compared or the cohorts used, and answers with three results that are each regenerable from source data:</w:t>
+      </w:r>
+    </w:p>
+    <w:p>
+      <w:pPr>
+        <w:rPr>
+          <w:rFonts w:ascii="Times New Roman" w:hAnsi="Times New Roman" w:cs="Times New Roman"/>
+        </w:rPr>
+      </w:pPr>
+      <w:r>
+        <w:rPr>
+          <w:rFonts w:ascii="Times New Roman" w:hAnsi="Times New Roman" w:cs="Times New Roman"/>
+        </w:rPr>
+        <w:t>1. A benchmark verdict can be a property of the cohorts. Over all 26 subsets of five diabetic kidney disease discovery cohorts, the reproducibility difference between a stability selector and a co-expression hub criterion ranged from -0.106 to +0.170 across three-cohort subsets, changing sign, while the mean external AUROC advantage stayed positive. The sweep was repeated under seven inner selectors and with the reference WGCNA package as the comparator.</w:t>
+      </w:r>
+    </w:p>
+    <w:p>
+      <w:pPr>
+        <w:rPr>
+          <w:rFonts w:ascii="Times New Roman" w:hAnsi="Times New Roman" w:cs="Times New Roman"/>
+        </w:rPr>
+      </w:pPr>
+      <w:r>
+        <w:rPr>
+          <w:rFonts w:ascii="Times New Roman" w:hAnsi="Times New Roman" w:cs="Times New Roman"/>
+        </w:rPr>
+        <w:t>2. A shared pre-analytical confounder becomes the most reproducible signal. Every discovery contrast compares needle biopsies with surgical tissue, and an immediate-early gene module tracked that contrast in 8 of 9 kidney datasets. A biopsy control retained 14-56% of the naive signal across seven diagnoses; residualising on a handling score removed most of the procurement-driven genes while batch correction by cohort was inert.</w:t>
+      </w:r>
+    </w:p>
+    <w:p>
+      <w:pPr>
+        <w:rPr>
+          <w:rFonts w:ascii="Times New Roman" w:hAnsi="Times New Roman" w:cs="Times New Roman"/>
+        </w:rPr>
+      </w:pPr>
+      <w:r>
+        <w:rPr>
+          <w:rFonts w:ascii="Times New Roman" w:hAnsi="Times New Roman" w:cs="Times New Roman"/>
+        </w:rPr>
+        <w:t>3. Both findings were tested in liver and colon against predictions fixed in advance. Three predictions were written and SHA-256-stamped before any liver or colon value was read; two failed, and the failures are reported in full. In colon, where both arms are biopsies, the module rose with inflammation, so the confounding it indexes depends on tissue context.</w:t>
+      </w:r>
+    </w:p>
+    <w:p>
+      <w:pPr>
+        <w:rPr>
+          <w:rFonts w:ascii="Times New Roman" w:hAnsi="Times New Roman" w:cs="Times New Roman"/>
+        </w:rPr>
+      </w:pPr>
+      <w:r>
+        <w:rPr>
+          <w:rFonts w:ascii="Times New Roman" w:hAnsi="Times New Roman" w:cs="Times New Roman"/>
+        </w:rPr>
+        <w:t>Research objects. The harmonised per-cohort matrices, the frozen 9,900-gene space, the sample-level phenotype and procurement annotations, and the cohort audit as a relational database whose views enforce the exclusion and overlap rules are deposited at https://doi.org/10.5281/zenodo.23051697, and the code at https://github.com/kdh6126/dkd-cross-cohort-audit (MIT). A single entry point regenerates every figure, table and reported number through 133 declared stages with fixed seeds, and a SHA-256 manifest ties the submitted files to that run. The registered cross-tissue predictions and their digests are in Additional file 7. All primary data are public GEO, KPMP, PRIDE, Mendeley Data, GWAS Catalog and Metabolomics Workbench records, listed with accessions in the Data availability section. Should the article be accepted, we will also deposit the processed data in GigaDB under CC0.</w:t>
+      </w:r>
+    </w:p>
+    <w:p>
+      <w:pPr>
+        <w:rPr>
+          <w:rFonts w:ascii="Times New Roman" w:hAnsi="Times New Roman" w:cs="Times New Roman"/>
+        </w:rPr>
+      </w:pPr>
+      <w:r>
+        <w:rPr>
+          <w:rFonts w:ascii="Times New Roman" w:hAnsi="Times New Roman" w:cs="Times New Roman"/>
+        </w:rPr>
+        <w:t>Journal policies. The study analysed only previously published, de-identified public data and generated no new human or animal data, so no ethics approval was required. The custom co-expression comparator is named as such throughout and is not presented as the reference WGCNA implementation, which was run separately. The manuscript is original, is not under consideration elsewhere, and all authors have approved this submission. The authors declare no competing interests.</w:t>
+      </w:r>
+    </w:p>
+    <w:p>
+      <w:pPr>
+        <w:rPr>
+          <w:rFonts w:ascii="Times New Roman" w:hAnsi="Times New Roman" w:cs="Times New Roman"/>
+        </w:rPr>
+      </w:pPr>
+      <w:r>
+        <w:rPr>
+          <w:rFonts w:ascii="Times New Roman" w:hAnsi="Times New Roman" w:cs="Times New Roman"/>
+        </w:rPr>
+        <w:t>Use of AI-assisted tools. Claude Code (Anthropic) and ChatGPT (OpenAI) assisted with code development and refactoring, proposals for control analyses, language editing and revision of author-written text, and the code that draws the figures; no figure or result was generated by an AI model directly. The same statement, with the tools cited, closes the manuscript.</w:t>
       </w:r>
     </w:p>
     <w:p>
@@ -185,7 +159,6 @@
         <w:rPr>
           <w:rFonts w:ascii="Times New Roman" w:hAnsi="Times New Roman" w:cs="Times New Roman"/>
         </w:rPr>
-        <w:lastRenderedPageBreak/>
         <w:t>Dohun Kim (corresponding author)</w:t>
       </w:r>
       <w:r>
@@ -364,7 +337,7 @@
                 <w:sz w:val="22"/>
                 <w:szCs w:val="24"/>
               </w:rPr>
-              <w:t>Briefings in Bioinformatics</w:t>
+              <w:t>GigaScience</w:t>
             </w:r>
           </w:p>
         </w:tc>
@@ -415,26 +388,10 @@
                 <w:sz w:val="22"/>
                 <w:szCs w:val="24"/>
               </w:rPr>
-              <w:t xml:space="preserve">Dohun Kim, Minho Bae, Jinho Park, Hayoung Lee, Hyeokjin Lim and </w:t>
+              <w:t>Dohun Kim, Minho Bae, Jinho Park, Hayoung Lee, Hyeokjin Lim and Seonghee Lee</w:t>
             </w:r>
             <w:proofErr w:type="spellStart"/>
-            <w:r>
-              <w:rPr>
-                <w:rFonts w:ascii="Times New Roman" w:hAnsi="Times New Roman" w:cs="Times New Roman"/>
-                <w:sz w:val="22"/>
-                <w:szCs w:val="24"/>
-              </w:rPr>
-              <w:t>Seonghee</w:t>
-            </w:r>
             <w:proofErr w:type="spellEnd"/>
-            <w:r>
-              <w:rPr>
-                <w:rFonts w:ascii="Times New Roman" w:hAnsi="Times New Roman" w:cs="Times New Roman"/>
-                <w:sz w:val="22"/>
-                <w:szCs w:val="24"/>
-              </w:rPr>
-              <w:t xml:space="preserve"> Lee</w:t>
-            </w:r>
           </w:p>
         </w:tc>
       </w:tr>

</xml_diff>